<commit_message>
Remove PancakeSwap references from whitepaper
</commit_message>
<xml_diff>
--- a/Stocken-STKN-Whitepaper.docx
+++ b/Stocken-STKN-Whitepaper.docx
@@ -12,7 +12,7 @@
         <w:rPr/>
         <w:drawing>
           <wp:inline distB="114300" distT="114300" distL="114300" distR="114300">
-            <wp:extent cx="4303713" cy="4303713"/>
+            <wp:extent cx="4446588" cy="4446588"/>
             <wp:effectExtent b="0" l="0" r="0" t="0"/>
             <wp:docPr id="1" name="image1.png"/>
             <a:graphic>
@@ -32,7 +32,7 @@
                   <pic:spPr>
                     <a:xfrm>
                       <a:off x="0" y="0"/>
-                      <a:ext cx="4303713" cy="4303713"/>
+                      <a:ext cx="4446588" cy="4446588"/>
                     </a:xfrm>
                     <a:prstGeom prst="rect"/>
                     <a:ln/>
@@ -239,18 +239,6 @@
         </w:rPr>
         <w:t xml:space="preserve">stocken.io   |   contact@stocken.io</w:t>
       </w:r>
-      <w:r>
-        <w:rPr>
-          <w:rtl w:val="0"/>
-        </w:rPr>
-      </w:r>
-    </w:p>
-    <w:p>
-      <w:pPr>
-        <w:spacing w:after="0" w:before="0" w:lineRule="auto"/>
-        <w:jc w:val="left"/>
-        <w:rPr/>
-      </w:pPr>
       <w:r>
         <w:rPr>
           <w:rtl w:val="0"/>
@@ -852,6 +840,11 @@
         </w:rPr>
         <w:t xml:space="preserve">Total Supply: 1,000,000,000 STKN hard cap — no tokens can ever be created beyond this limit</w:t>
       </w:r>
+      <w:r>
+        <w:rPr>
+          <w:rtl w:val="0"/>
+        </w:rPr>
+      </w:r>
     </w:p>
     <w:p>
       <w:pPr>
@@ -895,6 +888,11 @@
         </w:rPr>
         <w:t xml:space="preserve">Launch Price: $0.005 USD per STKN</w:t>
       </w:r>
+      <w:r>
+        <w:rPr>
+          <w:rtl w:val="0"/>
+        </w:rPr>
+      </w:r>
     </w:p>
     <w:p>
       <w:pPr>
@@ -938,6 +936,11 @@
         </w:rPr>
         <w:t xml:space="preserve">Blockchain: BNB Chain (BEP-20) for low fees and high speed</w:t>
       </w:r>
+      <w:r>
+        <w:rPr>
+          <w:rtl w:val="0"/>
+        </w:rPr>
+      </w:r>
     </w:p>
     <w:p>
       <w:pPr>
@@ -981,6 +984,11 @@
         </w:rPr>
         <w:t xml:space="preserve">Primary Use: Premium subscription payments (up to 30% via STKN) and user activity rewards</w:t>
       </w:r>
+      <w:r>
+        <w:rPr>
+          <w:rtl w:val="0"/>
+        </w:rPr>
+      </w:r>
     </w:p>
     <w:p>
       <w:pPr>
@@ -1024,6 +1032,11 @@
         </w:rPr>
         <w:t xml:space="preserve">Reward triggers: Real app usage, streaks, referrals</w:t>
       </w:r>
+      <w:r>
+        <w:rPr>
+          <w:rtl w:val="0"/>
+        </w:rPr>
+      </w:r>
     </w:p>
     <w:p>
       <w:pPr>
@@ -1067,6 +1080,11 @@
         </w:rPr>
         <w:t xml:space="preserve">STKN covers up to 30% of any subscription cost — remaining balance paid in fiat</w:t>
       </w:r>
+      <w:r>
+        <w:rPr>
+          <w:rtl w:val="0"/>
+        </w:rPr>
+      </w:r>
     </w:p>
     <w:p>
       <w:pPr>
@@ -1295,6 +1313,11 @@
         </w:rPr>
         <w:t xml:space="preserve">A BNB Chain-based utility token (STKN) with a fixed supply of 1 billion tokens</w:t>
       </w:r>
+      <w:r>
+        <w:rPr>
+          <w:rtl w:val="0"/>
+        </w:rPr>
+      </w:r>
     </w:p>
     <w:p>
       <w:pPr>
@@ -1338,6 +1361,11 @@
         </w:rPr>
         <w:t xml:space="preserve">A partner API that any authorized platform can use to reward users and accept STKN payments</w:t>
       </w:r>
+      <w:r>
+        <w:rPr>
+          <w:rtl w:val="0"/>
+        </w:rPr>
+      </w:r>
     </w:p>
     <w:p>
       <w:pPr>
@@ -1381,6 +1409,11 @@
         </w:rPr>
         <w:t xml:space="preserve">A transparent, on-chain reward and burn mechanism visible to all token holders</w:t>
       </w:r>
+      <w:r>
+        <w:rPr>
+          <w:rtl w:val="0"/>
+        </w:rPr>
+      </w:r>
     </w:p>
     <w:p>
       <w:pPr>
@@ -1423,6 +1456,11 @@
           <w:rtl w:val="0"/>
         </w:rPr>
         <w:t xml:space="preserve">A growing ecosystem where every new platform integration increases STKN utility and demand</w:t>
+      </w:r>
+      <w:r>
+        <w:rPr>
+          <w:rtl w:val="0"/>
+        </w:rPr>
       </w:r>
     </w:p>
     <w:p>
@@ -2066,7 +2104,7 @@
                 <w:szCs w:val="20"/>
                 <w:rtl w:val="0"/>
               </w:rPr>
-              <w:t xml:space="preserve">Use STKN to cover up to 30% of subscription cost</w:t>
+              <w:t xml:space="preserve">Use STKN to cover % of subscription cost across integrated platforms</w:t>
             </w:r>
             <w:r>
               <w:rPr>
@@ -2758,6 +2796,11 @@
         </w:rPr>
         <w:t xml:space="preserve">Partner apps define their own reward amounts, triggers, and payment terms independently — Stocken does not govern these decisions</w:t>
       </w:r>
+      <w:r>
+        <w:rPr>
+          <w:rtl w:val="0"/>
+        </w:rPr>
+      </w:r>
     </w:p>
     <w:p>
       <w:pPr>
@@ -2801,6 +2844,11 @@
         </w:rPr>
         <w:t xml:space="preserve">All STKN transactions across all partner apps flow through the same BNB Chain smart contract, ensuring full on-chain transparency</w:t>
       </w:r>
+      <w:r>
+        <w:rPr>
+          <w:rtl w:val="0"/>
+        </w:rPr>
+      </w:r>
     </w:p>
     <w:p>
       <w:pPr>
@@ -2844,6 +2892,11 @@
         </w:rPr>
         <w:t xml:space="preserve">Partner apps must be authorized via a signed Partner Agreement with the Stocken team before API access is granted</w:t>
       </w:r>
+      <w:r>
+        <w:rPr>
+          <w:rtl w:val="0"/>
+        </w:rPr>
+      </w:r>
     </w:p>
     <w:p>
       <w:pPr>
@@ -2887,6 +2940,11 @@
         </w:rPr>
         <w:t xml:space="preserve">Each partner receives a unique API key with configurable rate limits and permissions</w:t>
       </w:r>
+      <w:r>
+        <w:rPr>
+          <w:rtl w:val="0"/>
+        </w:rPr>
+      </w:r>
     </w:p>
     <w:p>
       <w:pPr>
@@ -3016,6 +3074,11 @@
         </w:rPr>
         <w:t xml:space="preserve">Staking STKN for early access to new platform features</w:t>
       </w:r>
+      <w:r>
+        <w:rPr>
+          <w:rtl w:val="0"/>
+        </w:rPr>
+      </w:r>
     </w:p>
     <w:p>
       <w:pPr>
@@ -3059,6 +3122,11 @@
         </w:rPr>
         <w:t xml:space="preserve">Governance — STKN holders vote on ecosystem-wide decisions</w:t>
       </w:r>
+      <w:r>
+        <w:rPr>
+          <w:rtl w:val="0"/>
+        </w:rPr>
+      </w:r>
     </w:p>
     <w:p>
       <w:pPr>
@@ -3102,6 +3170,11 @@
         </w:rPr>
         <w:t xml:space="preserve">Exclusive NFT badges for top performers across the ecosystem</w:t>
       </w:r>
+      <w:r>
+        <w:rPr>
+          <w:rtl w:val="0"/>
+        </w:rPr>
+      </w:r>
     </w:p>
     <w:p>
       <w:pPr>
@@ -3144,6 +3217,11 @@
           <w:rtl w:val="0"/>
         </w:rPr>
         <w:t xml:space="preserve">DeFi integrations — use STKN in liquidity pools and yield strategies</w:t>
+      </w:r>
+      <w:r>
+        <w:rPr>
+          <w:rtl w:val="0"/>
+        </w:rPr>
       </w:r>
     </w:p>
     <w:p>
@@ -5261,6 +5339,11 @@
         </w:rPr>
         <w:t xml:space="preserve">5% of all STKN received as payment will be burned each quarter</w:t>
       </w:r>
+      <w:r>
+        <w:rPr>
+          <w:rtl w:val="0"/>
+        </w:rPr>
+      </w:r>
     </w:p>
     <w:p>
       <w:pPr>
@@ -5304,6 +5387,11 @@
         </w:rPr>
         <w:t xml:space="preserve">Burns are executed on-chain and publicly verifiable</w:t>
       </w:r>
+      <w:r>
+        <w:rPr>
+          <w:rtl w:val="0"/>
+        </w:rPr>
+      </w:r>
     </w:p>
     <w:p>
       <w:pPr>
@@ -5347,6 +5435,11 @@
         </w:rPr>
         <w:t xml:space="preserve">Burn events will be announced and celebrated quarterly</w:t>
       </w:r>
+      <w:r>
+        <w:rPr>
+          <w:rtl w:val="0"/>
+        </w:rPr>
+      </w:r>
     </w:p>
     <w:p>
       <w:pPr>
@@ -5532,6 +5625,11 @@
         </w:rPr>
         <w:t xml:space="preserve">Usage-first — STKN is earned through real app actions such as building a portfolio, completing your profile, and engaging with premium features</w:t>
       </w:r>
+      <w:r>
+        <w:rPr>
+          <w:rtl w:val="0"/>
+        </w:rPr>
+      </w:r>
     </w:p>
     <w:p>
       <w:pPr>
@@ -5575,6 +5673,11 @@
         </w:rPr>
         <w:t xml:space="preserve">Sustainable — reward amounts and caps are calibrated to ensure the 400M STKN pool lasts the full 5-year distribution period without inflation</w:t>
       </w:r>
+      <w:r>
+        <w:rPr>
+          <w:rtl w:val="0"/>
+        </w:rPr>
+      </w:r>
     </w:p>
     <w:p>
       <w:pPr>
@@ -5618,6 +5721,11 @@
         </w:rPr>
         <w:t xml:space="preserve">Tamper-resistant — all reward triggers are server-verified; simple logins or repetitive actions do not qualify</w:t>
       </w:r>
+      <w:r>
+        <w:rPr>
+          <w:rtl w:val="0"/>
+        </w:rPr>
+      </w:r>
     </w:p>
     <w:p>
       <w:pPr>
@@ -5728,6 +5836,11 @@
         </w:rPr>
         <w:t xml:space="preserve">Onboarding rewards — one-time STKN bonuses for completing key first actions on the platform (first portfolio entry, profile completion, first watchlist stock, etc.)</w:t>
       </w:r>
+      <w:r>
+        <w:rPr>
+          <w:rtl w:val="0"/>
+        </w:rPr>
+      </w:r>
     </w:p>
     <w:p>
       <w:pPr>
@@ -5771,6 +5884,11 @@
         </w:rPr>
         <w:t xml:space="preserve">Engagement rewards — periodic STKN for sustained, meaningful usage such as portfolio updates and activity streaks</w:t>
       </w:r>
+      <w:r>
+        <w:rPr>
+          <w:rtl w:val="0"/>
+        </w:rPr>
+      </w:r>
     </w:p>
     <w:p>
       <w:pPr>
@@ -5814,6 +5932,11 @@
         </w:rPr>
         <w:t xml:space="preserve">Growth rewards — STKN for actions that grow the platform's user base, primarily successful referrals</w:t>
       </w:r>
+      <w:r>
+        <w:rPr>
+          <w:rtl w:val="0"/>
+        </w:rPr>
+      </w:r>
     </w:p>
     <w:p>
       <w:pPr>
@@ -5857,6 +5980,11 @@
         </w:rPr>
         <w:t xml:space="preserve">Loyalty rewards — STKN bonuses for long-term commitment such as annual subscriptions and top portfolio performance</w:t>
       </w:r>
+      <w:r>
+        <w:rPr>
+          <w:rtl w:val="0"/>
+        </w:rPr>
+      </w:r>
     </w:p>
     <w:p>
       <w:pPr>
@@ -6010,6 +6138,11 @@
         </w:rPr>
         <w:t xml:space="preserve">All rewards are tied to verified server-side actions — client-side manipulation is not possible</w:t>
       </w:r>
+      <w:r>
+        <w:rPr>
+          <w:rtl w:val="0"/>
+        </w:rPr>
+      </w:r>
     </w:p>
     <w:p>
       <w:pPr>
@@ -6053,6 +6186,11 @@
         </w:rPr>
         <w:t xml:space="preserve">Activity caps prevent reward farming while allowing genuine heavy users to benefit</w:t>
       </w:r>
+      <w:r>
+        <w:rPr>
+          <w:rtl w:val="0"/>
+        </w:rPr>
+      </w:r>
     </w:p>
     <w:p>
       <w:pPr>
@@ -6096,6 +6234,11 @@
         </w:rPr>
         <w:t xml:space="preserve">Referral rewards are released only after the referred user completes onboarding and remains active</w:t>
       </w:r>
+      <w:r>
+        <w:rPr>
+          <w:rtl w:val="0"/>
+        </w:rPr>
+      </w:r>
     </w:p>
     <w:p>
       <w:pPr>
@@ -6139,6 +6282,11 @@
         </w:rPr>
         <w:t xml:space="preserve">Suspicious or automated activity triggers automatic review and potential wallet freeze</w:t>
       </w:r>
+      <w:r>
+        <w:rPr>
+          <w:rtl w:val="0"/>
+        </w:rPr>
+      </w:r>
     </w:p>
     <w:p>
       <w:pPr>
@@ -6300,6 +6448,11 @@
         </w:rPr>
         <w:t xml:space="preserve">User selects a subscription plan on their integrated platform</w:t>
       </w:r>
+      <w:r>
+        <w:rPr>
+          <w:rtl w:val="0"/>
+        </w:rPr>
+      </w:r>
     </w:p>
     <w:p>
       <w:pPr>
@@ -6343,6 +6496,11 @@
         </w:rPr>
         <w:t xml:space="preserve">At checkout, user applies STKN to cover up to 30% of the total cost</w:t>
       </w:r>
+      <w:r>
+        <w:rPr>
+          <w:rtl w:val="0"/>
+        </w:rPr>
+      </w:r>
     </w:p>
     <w:p>
       <w:pPr>
@@ -6386,6 +6544,11 @@
         </w:rPr>
         <w:t xml:space="preserve">Remaining 70% or more is charged in fiat via standard payment methods</w:t>
       </w:r>
+      <w:r>
+        <w:rPr>
+          <w:rtl w:val="0"/>
+        </w:rPr>
+      </w:r>
     </w:p>
     <w:p>
       <w:pPr>
@@ -6428,6 +6591,11 @@
           <w:rtl w:val="0"/>
         </w:rPr>
         <w:t xml:space="preserve">STKN used for payment is collected by the treasury; 5% of collected STKN is burned quarterly</w:t>
+      </w:r>
+      <w:r>
+        <w:rPr>
+          <w:rtl w:val="0"/>
+        </w:rPr>
       </w:r>
     </w:p>
     <w:p>
@@ -7658,6 +7826,11 @@
         </w:rPr>
         <w:t xml:space="preserve">Transaction fees under $0.01 — ideal for micro-reward distributions</w:t>
       </w:r>
+      <w:r>
+        <w:rPr>
+          <w:rtl w:val="0"/>
+        </w:rPr>
+      </w:r>
     </w:p>
     <w:p>
       <w:pPr>
@@ -7701,6 +7874,11 @@
         </w:rPr>
         <w:t xml:space="preserve">Block time of ~3 seconds — near-instant reward confirmations</w:t>
       </w:r>
+      <w:r>
+        <w:rPr>
+          <w:rtl w:val="0"/>
+        </w:rPr>
+      </w:r>
     </w:p>
     <w:p>
       <w:pPr>
@@ -7744,6 +7922,11 @@
         </w:rPr>
         <w:t xml:space="preserve">EVM-compatible — wide developer tooling and wallet support</w:t>
       </w:r>
+      <w:r>
+        <w:rPr>
+          <w:rtl w:val="0"/>
+        </w:rPr>
+      </w:r>
     </w:p>
     <w:p>
       <w:pPr>
@@ -7787,6 +7970,11 @@
         </w:rPr>
         <w:t xml:space="preserve">Large retail user base already familiar with BEP-20 tokens</w:t>
       </w:r>
+      <w:r>
+        <w:rPr>
+          <w:rtl w:val="0"/>
+        </w:rPr>
+      </w:r>
     </w:p>
     <w:p>
       <w:pPr>
@@ -7829,6 +8017,11 @@
           <w:rtl w:val="0"/>
         </w:rPr>
         <w:t xml:space="preserve">Seamless MetaMask integration with no additional setup</w:t>
+      </w:r>
+      <w:r>
+        <w:rPr>
+          <w:rtl w:val="0"/>
+        </w:rPr>
       </w:r>
     </w:p>
     <w:p>
@@ -9057,7 +9250,7 @@
                 <w:szCs w:val="20"/>
                 <w:rtl w:val="0"/>
               </w:rPr>
-              <w:t xml:space="preserve">Mainnet deployment, public sale, PancakeSwap listing, Express.js API launch (api.stocken.io/v1), app wallet integration, rewards launch</w:t>
+              <w:t xml:space="preserve">Mainnet deployment, public sale, Express.js API launch (api.stocken.io/v1), app wallet integration, rewards launch</w:t>
             </w:r>
             <w:r>
               <w:rPr>
@@ -10737,6 +10930,11 @@
         </w:rPr>
         <w:t xml:space="preserve">BNB Chain Official Documentation — https://docs.bnbchain.org</w:t>
       </w:r>
+      <w:r>
+        <w:rPr>
+          <w:rtl w:val="0"/>
+        </w:rPr>
+      </w:r>
     </w:p>
     <w:p>
       <w:pPr>
@@ -10780,6 +10978,11 @@
         </w:rPr>
         <w:t xml:space="preserve">BEP-20 Token Standard — https://github.com/bnb-chain/BEPs/blob/master/BEPs/BEP20.md</w:t>
       </w:r>
+      <w:r>
+        <w:rPr>
+          <w:rtl w:val="0"/>
+        </w:rPr>
+      </w:r>
     </w:p>
     <w:p>
       <w:pPr>
@@ -10823,6 +11026,11 @@
         </w:rPr>
         <w:t xml:space="preserve">Ethereum ERC-20 Standard (BEP-20 basis) — https://eips.ethereum.org/EIPS/eip-20</w:t>
       </w:r>
+      <w:r>
+        <w:rPr>
+          <w:rtl w:val="0"/>
+        </w:rPr>
+      </w:r>
     </w:p>
     <w:p>
       <w:pPr>
@@ -10866,6 +11074,11 @@
         </w:rPr>
         <w:t xml:space="preserve">Solidity Smart Contract Language — https://soliditylang.org</w:t>
       </w:r>
+      <w:r>
+        <w:rPr>
+          <w:rtl w:val="0"/>
+        </w:rPr>
+      </w:r>
     </w:p>
     <w:p>
       <w:pPr>
@@ -10952,6 +11165,11 @@
         </w:rPr>
         <w:t xml:space="preserve">Prevention of Money Laundering Act (PMLA), India — https://finmin.nic.in</w:t>
       </w:r>
+      <w:r>
+        <w:rPr>
+          <w:rtl w:val="0"/>
+        </w:rPr>
+      </w:r>
     </w:p>
     <w:p>
       <w:pPr>
@@ -10995,6 +11213,11 @@
         </w:rPr>
         <w:t xml:space="preserve">Foreign Exchange Management Act (FEMA), India — https://rbi.org.in</w:t>
       </w:r>
+      <w:r>
+        <w:rPr>
+          <w:rtl w:val="0"/>
+        </w:rPr>
+      </w:r>
     </w:p>
     <w:p>
       <w:pPr>
@@ -11038,6 +11261,11 @@
         </w:rPr>
         <w:t xml:space="preserve">Markets in Crypto-Assets Regulation (MiCA), EU — https://eur-lex.europa.eu</w:t>
       </w:r>
+      <w:r>
+        <w:rPr>
+          <w:rtl w:val="0"/>
+        </w:rPr>
+      </w:r>
     </w:p>
     <w:p>
       <w:pPr>
@@ -11081,6 +11309,11 @@
         </w:rPr>
         <w:t xml:space="preserve">Financial Action Task Force (FATF) Virtual Asset Guidelines — https://fatf-gafi.org</w:t>
       </w:r>
+      <w:r>
+        <w:rPr>
+          <w:rtl w:val="0"/>
+        </w:rPr>
+      </w:r>
     </w:p>
     <w:p>
       <w:pPr>
@@ -11165,7 +11398,12 @@
           <w:vertAlign w:val="baseline"/>
           <w:rtl w:val="0"/>
         </w:rPr>
-        <w:t xml:space="preserve">PancakeSwap DEX — https://pancakeswap.finance</w:t>
+        <w:t xml:space="preserve">BSCScan Block Explorer — https://bscscan.com</w:t>
+      </w:r>
+      <w:r>
+        <w:rPr>
+          <w:rtl w:val="0"/>
+        </w:rPr>
       </w:r>
     </w:p>
     <w:p>
@@ -11208,7 +11446,12 @@
           <w:vertAlign w:val="baseline"/>
           <w:rtl w:val="0"/>
         </w:rPr>
-        <w:t xml:space="preserve">BSCScan Block Explorer — https://bscscan.com</w:t>
+        <w:t xml:space="preserve">CoinMarketCap Token Listings — https://coinmarketcap.com</w:t>
+      </w:r>
+      <w:r>
+        <w:rPr>
+          <w:rtl w:val="0"/>
+        </w:rPr>
       </w:r>
     </w:p>
     <w:p>
@@ -11251,7 +11494,12 @@
           <w:vertAlign w:val="baseline"/>
           <w:rtl w:val="0"/>
         </w:rPr>
-        <w:t xml:space="preserve">CoinMarketCap Token Listings — https://coinmarketcap.com</w:t>
+        <w:t xml:space="preserve">CoinGecko Token Listings — https://coingecko.com</w:t>
+      </w:r>
+      <w:r>
+        <w:rPr>
+          <w:rtl w:val="0"/>
+        </w:rPr>
       </w:r>
     </w:p>
     <w:p>
@@ -11294,7 +11542,12 @@
           <w:vertAlign w:val="baseline"/>
           <w:rtl w:val="0"/>
         </w:rPr>
-        <w:t xml:space="preserve">CoinGecko Token Listings — https://coingecko.com</w:t>
+        <w:t xml:space="preserve">Binance — Global Cryptocurrency Exchange — https://binance.com</w:t>
+      </w:r>
+      <w:r>
+        <w:rPr>
+          <w:rtl w:val="0"/>
+        </w:rPr>
       </w:r>
     </w:p>
     <w:p>
@@ -11337,7 +11590,12 @@
           <w:vertAlign w:val="baseline"/>
           <w:rtl w:val="0"/>
         </w:rPr>
-        <w:t xml:space="preserve">Binance — Global Cryptocurrency Exchange — https://binance.com</w:t>
+        <w:t xml:space="preserve">KuCoin — Global Cryptocurrency Exchange — https://kucoin.com</w:t>
+      </w:r>
+      <w:r>
+        <w:rPr>
+          <w:rtl w:val="0"/>
+        </w:rPr>
       </w:r>
     </w:p>
     <w:p>
@@ -11380,7 +11638,12 @@
           <w:vertAlign w:val="baseline"/>
           <w:rtl w:val="0"/>
         </w:rPr>
-        <w:t xml:space="preserve">KuCoin — Global Cryptocurrency Exchange — https://kucoin.com</w:t>
+        <w:t xml:space="preserve">OKX — Global Cryptocurrency Exchange — https://okx.com</w:t>
+      </w:r>
+      <w:r>
+        <w:rPr>
+          <w:rtl w:val="0"/>
+        </w:rPr>
       </w:r>
     </w:p>
     <w:p>
@@ -11423,7 +11686,12 @@
           <w:vertAlign w:val="baseline"/>
           <w:rtl w:val="0"/>
         </w:rPr>
-        <w:t xml:space="preserve">OKX — Global Cryptocurrency Exchange — https://okx.com</w:t>
+        <w:t xml:space="preserve">WazirX — Indian Cryptocurrency Exchange — https://wazirx.com</w:t>
+      </w:r>
+      <w:r>
+        <w:rPr>
+          <w:rtl w:val="0"/>
+        </w:rPr>
       </w:r>
     </w:p>
     <w:p>
@@ -11466,7 +11734,12 @@
           <w:vertAlign w:val="baseline"/>
           <w:rtl w:val="0"/>
         </w:rPr>
-        <w:t xml:space="preserve">WazirX — Indian Cryptocurrency Exchange — https://wazirx.com</w:t>
+        <w:t xml:space="preserve">CoinDCX — Indian Cryptocurrency Exchange — https://coindcx.com</w:t>
+      </w:r>
+      <w:r>
+        <w:rPr>
+          <w:rtl w:val="0"/>
+        </w:rPr>
       </w:r>
     </w:p>
     <w:p>
@@ -11509,50 +11782,12 @@
           <w:vertAlign w:val="baseline"/>
           <w:rtl w:val="0"/>
         </w:rPr>
-        <w:t xml:space="preserve">CoinDCX — Indian Cryptocurrency Exchange — https://coindcx.com</w:t>
-      </w:r>
-    </w:p>
-    <w:p>
-      <w:pPr>
-        <w:keepNext w:val="0"/>
-        <w:keepLines w:val="0"/>
-        <w:pageBreakBefore w:val="0"/>
-        <w:widowControl w:val="1"/>
-        <w:numPr>
-          <w:ilvl w:val="0"/>
-          <w:numId w:val="1"/>
-        </w:numPr>
-        <w:pBdr>
-          <w:top w:space="0" w:sz="0" w:val="nil"/>
-          <w:left w:space="0" w:sz="0" w:val="nil"/>
-          <w:bottom w:space="0" w:sz="0" w:val="nil"/>
-          <w:right w:space="0" w:sz="0" w:val="nil"/>
-          <w:between w:space="0" w:sz="0" w:val="nil"/>
-        </w:pBdr>
-        <w:shd w:fill="auto" w:val="clear"/>
-        <w:spacing w:after="40" w:before="40" w:line="240" w:lineRule="auto"/>
-        <w:ind w:left="720" w:right="0" w:hanging="360"/>
-        <w:jc w:val="left"/>
-        <w:rPr/>
-      </w:pPr>
-      <w:r>
-        <w:rPr>
-          <w:rFonts w:ascii="Arial" w:cs="Arial" w:eastAsia="Arial" w:hAnsi="Arial"/>
-          <w:b w:val="0"/>
-          <w:bCs w:val="0"/>
-          <w:i w:val="0"/>
-          <w:iCs w:val="0"/>
-          <w:smallCaps w:val="0"/>
-          <w:strike w:val="0"/>
-          <w:color w:val="111827"/>
-          <w:sz w:val="22"/>
-          <w:szCs w:val="22"/>
-          <w:u w:val="none"/>
-          <w:shd w:fill="auto" w:val="clear"/>
-          <w:vertAlign w:val="baseline"/>
-          <w:rtl w:val="0"/>
-        </w:rPr>
         <w:t xml:space="preserve">Zebpay — Indian Cryptocurrency Exchange — https://zebpay.com</w:t>
+      </w:r>
+      <w:r>
+        <w:rPr>
+          <w:rtl w:val="0"/>
+        </w:rPr>
       </w:r>
     </w:p>
     <w:p>
@@ -11677,6 +11912,19 @@
       <w:spacing w:after="0" w:before="80" w:lineRule="auto"/>
       <w:rPr/>
     </w:pPr>
+    <w:hyperlink r:id="rId1">
+      <w:r>
+        <w:rPr>
+          <w:rFonts w:ascii="Arial" w:cs="Arial" w:eastAsia="Arial" w:hAnsi="Arial"/>
+          <w:color w:val="1155cc"/>
+          <w:sz w:val="18"/>
+          <w:szCs w:val="18"/>
+          <w:u w:val="single"/>
+          <w:rtl w:val="0"/>
+        </w:rPr>
+        <w:t xml:space="preserve">stocken.io</w:t>
+      </w:r>
+    </w:hyperlink>
     <w:r>
       <w:rPr>
         <w:rFonts w:ascii="Arial" w:cs="Arial" w:eastAsia="Arial" w:hAnsi="Arial"/>
@@ -11685,7 +11933,8 @@
         <w:szCs w:val="18"/>
         <w:rtl w:val="0"/>
       </w:rPr>
-      <w:t xml:space="preserve">stocken.ioPage </w:t>
+      <w:tab/>
+      <w:t xml:space="preserve">Page </w:t>
     </w:r>
     <w:r>
       <w:rPr>
@@ -11732,6 +11981,7 @@
         <w:rtl w:val="0"/>
       </w:rPr>
       <w:t xml:space="preserve">STOCKEN (STKN) Whitepaper</w:t>
+      <w:tab/>
     </w:r>
     <w:r>
       <w:rPr>
@@ -12562,7 +12812,7 @@
 
 <file path=customXML/item1.xml><?xml version="1.0" encoding="utf-8"?>
 <go:gDocsCustomXmlDataStorage xmlns:go="http://customooxmlschemas.google.com/" xmlns:r="http://schemas.openxmlformats.org/officeDocument/2006/relationships" uri="GoogleDocsCustomDataVersion2">
-  <go:docsCustomData xmlns:go="http://customooxmlschemas.google.com/" roundtripDataSignature="AMtx7mivuaz8Gv3SJjjj8b+Ja6ucZnHO+g==">CgMxLjA4AHIhMUNmQTQ3M1VtOVhHYVoyY2VNTkt2ZGpBZWI1QXFyRkwx</go:docsCustomData>
+  <go:docsCustomData xmlns:go="http://customooxmlschemas.google.com/" roundtripDataSignature="AMtx7mgA8w3tWf2509YtyksriZv76ii0dQ==">CgMxLjA4AHIhMVJvZkhEd0JIX3JTUGNWZFhFOC14RXJsVklRcDk4TFlz</go:docsCustomData>
 </go:gDocsCustomXmlDataStorage>
 </file>
 

</xml_diff>